<commit_message>
BCMOHAD-29725 Dynamic CurrentYear Update logic added
</commit_message>
<xml_diff>
--- a/ALR-DocgenTemplates/Renewal Application form.docx
+++ b/ALR-DocgenTemplates/Renewal Application form.docx
@@ -1,6 +1,6 @@
 
 <file path=word/document.xml><?xml version="1.0" encoding="utf-8"?>
-<w:document xmlns:wpc="http://schemas.microsoft.com/office/word/2010/wordprocessingCanvas" xmlns:cx="http://schemas.microsoft.com/office/drawing/2014/chartex" xmlns:cx1="http://schemas.microsoft.com/office/drawing/2015/9/8/chartex" xmlns:cx2="http://schemas.microsoft.com/office/drawing/2015/10/21/chartex" xmlns:cx3="http://schemas.microsoft.com/office/drawing/2016/5/9/chartex" xmlns:cx4="http://schemas.microsoft.com/office/drawing/2016/5/10/chartex" xmlns:cx5="http://schemas.microsoft.com/office/drawing/2016/5/11/chartex" xmlns:cx6="http://schemas.microsoft.com/office/drawing/2016/5/12/chartex" xmlns:cx7="http://schemas.microsoft.com/office/drawing/2016/5/13/chartex" xmlns:cx8="http://schemas.microsoft.com/office/drawing/2016/5/14/chartex" xmlns:mc="http://schemas.openxmlformats.org/markup-compatibility/2006" xmlns:aink="http://schemas.microsoft.com/office/drawing/2016/ink" xmlns:am3d="http://schemas.microsoft.com/office/drawing/2017/model3d" xmlns:o="urn:schemas-microsoft-com:office:office" xmlns:oel="http://schemas.microsoft.com/office/2019/extlst" xmlns:r="http://schemas.openxmlformats.org/officeDocument/2006/relationships" xmlns:m="http://schemas.openxmlformats.org/officeDocument/2006/math" xmlns:v="urn:schemas-microsoft-com:vml" xmlns:wp14="http://schemas.microsoft.com/office/word/2010/wordprocessingDrawing" xmlns:wp="http://schemas.openxmlformats.org/drawingml/2006/wordprocessingDrawing" xmlns:w10="urn:schemas-microsoft-com:office:word" xmlns:w="http://schemas.openxmlformats.org/wordprocessingml/2006/main" xmlns:w14="http://schemas.microsoft.com/office/word/2010/wordml" xmlns:w15="http://schemas.microsoft.com/office/word/2012/wordml" xmlns:w16cex="http://schemas.microsoft.com/office/word/2018/wordml/cex" xmlns:w16cid="http://schemas.microsoft.com/office/word/2016/wordml/cid" xmlns:w16="http://schemas.microsoft.com/office/word/2018/wordml" xmlns:w16sdtdh="http://schemas.microsoft.com/office/word/2020/wordml/sdtdatahash" xmlns:w16se="http://schemas.microsoft.com/office/word/2015/wordml/symex" xmlns:wpg="http://schemas.microsoft.com/office/word/2010/wordprocessingGroup" xmlns:wpi="http://schemas.microsoft.com/office/word/2010/wordprocessingInk" xmlns:wne="http://schemas.microsoft.com/office/word/2006/wordml" xmlns:wps="http://schemas.microsoft.com/office/word/2010/wordprocessingShape" mc:Ignorable="w14 w15 w16se w16cid w16 w16cex w16sdtdh wp14">
+<w:document xmlns:wpc="http://schemas.microsoft.com/office/word/2010/wordprocessingCanvas" xmlns:cx="http://schemas.microsoft.com/office/drawing/2014/chartex" xmlns:cx1="http://schemas.microsoft.com/office/drawing/2015/9/8/chartex" xmlns:cx2="http://schemas.microsoft.com/office/drawing/2015/10/21/chartex" xmlns:cx3="http://schemas.microsoft.com/office/drawing/2016/5/9/chartex" xmlns:cx4="http://schemas.microsoft.com/office/drawing/2016/5/10/chartex" xmlns:cx5="http://schemas.microsoft.com/office/drawing/2016/5/11/chartex" xmlns:cx6="http://schemas.microsoft.com/office/drawing/2016/5/12/chartex" xmlns:cx7="http://schemas.microsoft.com/office/drawing/2016/5/13/chartex" xmlns:cx8="http://schemas.microsoft.com/office/drawing/2016/5/14/chartex" xmlns:mc="http://schemas.openxmlformats.org/markup-compatibility/2006" xmlns:aink="http://schemas.microsoft.com/office/drawing/2016/ink" xmlns:am3d="http://schemas.microsoft.com/office/drawing/2017/model3d" xmlns:o="urn:schemas-microsoft-com:office:office" xmlns:oel="http://schemas.microsoft.com/office/2019/extlst" xmlns:r="http://schemas.openxmlformats.org/officeDocument/2006/relationships" xmlns:m="http://schemas.openxmlformats.org/officeDocument/2006/math" xmlns:v="urn:schemas-microsoft-com:vml" xmlns:wp14="http://schemas.microsoft.com/office/word/2010/wordprocessingDrawing" xmlns:wp="http://schemas.openxmlformats.org/drawingml/2006/wordprocessingDrawing" xmlns:w10="urn:schemas-microsoft-com:office:word" xmlns:w="http://schemas.openxmlformats.org/wordprocessingml/2006/main" xmlns:w14="http://schemas.microsoft.com/office/word/2010/wordml" xmlns:w15="http://schemas.microsoft.com/office/word/2012/wordml" xmlns:w16cex="http://schemas.microsoft.com/office/word/2018/wordml/cex" xmlns:w16cid="http://schemas.microsoft.com/office/word/2016/wordml/cid" xmlns:w16="http://schemas.microsoft.com/office/word/2018/wordml" xmlns:w16du="http://schemas.microsoft.com/office/word/2023/wordml/word16du" xmlns:w16sdtdh="http://schemas.microsoft.com/office/word/2020/wordml/sdtdatahash" xmlns:w16sdtfl="http://schemas.microsoft.com/office/word/2024/wordml/sdtformatlock" xmlns:w16se="http://schemas.microsoft.com/office/word/2015/wordml/symex" xmlns:wpg="http://schemas.microsoft.com/office/word/2010/wordprocessingGroup" xmlns:wpi="http://schemas.microsoft.com/office/word/2010/wordprocessingInk" xmlns:wne="http://schemas.microsoft.com/office/word/2006/wordml" xmlns:wps="http://schemas.microsoft.com/office/word/2010/wordprocessingShape" mc:Ignorable="w14 w15 w16se w16cid w16 w16cex w16sdtdh w16sdtfl w16du wp14">
   <w:body>
     <w:p>
       <w:pPr>
@@ -1324,7 +1324,7 @@
                 </mc:Choice>
                 <mc:Fallback>
                   <w:pict>
-                    <v:group w14:anchorId="7E66859C" id="Group 50" o:spid="_x0000_s1026" style="position:absolute;margin-left:16.45pt;margin-top:7.85pt;width:36.55pt;height:6.55pt;z-index:15737344;mso-wrap-distance-left:0;mso-wrap-distance-right:0" coordsize="464184,83185" o:gfxdata="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">
+                    <v:group w14:anchorId="64D0C4E4" id="Group 50" o:spid="_x0000_s1026" style="position:absolute;margin-left:16.45pt;margin-top:7.85pt;width:36.55pt;height:6.55pt;z-index:15737344;mso-wrap-distance-left:0;mso-wrap-distance-right:0" coordsize="464184,83185" o:gfxdata="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">
                       <v:shape id="Graphic 51" o:spid="_x0000_s1027" style="position:absolute;left:9525;top:9525;width:445134;height:64135;visibility:visible;mso-wrap-style:square;v-text-anchor:top" coordsize="445134,64135" o:gfxdata="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" path="m,25318r809,l2161,25587r2696,-269l7553,25048r3553,-451l16176,23698r5070,-898l27994,21256r7284,-1330l42562,18596r7738,-1559l92769,12007,132304,9176,174919,7266,219925,6141r45028,-540l305576,5444r9549,-3l324446,5455r40283,167l371630,5666r9035,57l388838,5791r7323,57l403483,5906r6590,327l415564,6011r5490,-222l425194,5110r3911,-593l433016,3923r3560,-796l439032,2448r2457,-679l443074,780r772,-336l444618,108r-953,324l442654,864r-2064,890l437779,3037r-2810,1283l431115,6098r-4312,2030l422492,10157r-5174,2460l411909,15214r-5409,2598l365761,33434,326471,43969r-42288,9151l244904,59707r-30676,3120l206122,63427r-8515,638l189929,64093r-7677,27l175130,63525r-6968,-533l135094,58360r-5981,-1324l123132,55712r-5658,-1495l112233,52953r-5242,-1264l102187,50741,97667,49452,93147,48163,89046,46571,85115,45218,81185,43866,77863,42492,74085,41337,43063,35494r-3384,-592l36295,34310r-3120,-904l30572,32631r-2602,-775l25146,30649r-1086,-396e" filled="f" strokecolor="#004de6" strokeweight="1.5pt">
                         <v:path arrowok="t"/>
                       </v:shape>
@@ -4044,7 +4044,7 @@
                 </mc:Choice>
                 <mc:Fallback>
                   <w:pict>
-                    <v:group w14:anchorId="518BC867" id="Group 52" o:spid="_x0000_s1026" style="position:absolute;margin-left:0;margin-top:3.4pt;width:90.3pt;height:12.95pt;z-index:15737856;mso-wrap-distance-left:0;mso-wrap-distance-right:0" coordsize="11468,1644" o:gfxdata="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">
+                    <v:group w14:anchorId="10675E27" id="Group 52" o:spid="_x0000_s1026" style="position:absolute;margin-left:0;margin-top:3.4pt;width:90.3pt;height:12.95pt;z-index:15737856;mso-wrap-distance-left:0;mso-wrap-distance-right:0" coordsize="11468,1644" o:gfxdata="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">
                       <v:shape id="Graphic 53" o:spid="_x0000_s1027" style="position:absolute;left:333;top:333;width:10801;height:978;visibility:visible;mso-wrap-style:square;v-text-anchor:top" coordsize="1080135,97790" o:gfxdata="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" path="m413645,48239r540,-270l415087,47519r1797,-899l418681,45722r2548,-1545l424429,42847r3201,-1330l431648,39959r4437,-1320l440521,37319r5420,-1300l451051,34928r5111,-1090l461091,32887r5658,-789l472407,31307r6544,-614l485001,30188r6050,-506l497020,29071r6027,-8l509073,29055r6018,574l521160,30141r6071,513l533327,31182r6140,956l545606,33093r6180,1496l557996,35873r6210,1285l570726,38613r6000,1231l582724,41074r5852,918l593990,43255r5413,1265l604466,46092r4740,1336l613947,48764r4347,1363l622431,51272r4138,1144l630359,53442r3672,855l637704,55152r16460,2530l657330,58006r15272,562l675646,58603r2759,-29l681727,58546r3321,-27l688826,58457r3705,-54l696236,58349r3915,-339l703958,58222r3807,212l711622,59095r3751,578l719123,60252r3443,778l726460,61694r24682,3560l755476,65711r22766,1412l782622,67309r21880,361l809213,67699r4914,263l819283,67684r5156,-278l830128,66658r5311,-654l840751,65351r5378,-857l851155,63764r5027,-730l861030,62268r4569,-644l870168,60979r4299,-590l878571,59897r4103,-491l886238,59004r3982,-332l894203,58339r3939,-239l902467,57904r4324,-195l911328,57591r4840,-94l921008,57403r5414,233l931507,57339r5084,-298l941523,56331r5152,-618l951827,55094r5472,-791l962419,53629r5119,-673l972620,52528r4772,-857l982165,50814r4562,-1252l991055,48490r4327,-1073l999449,46235r3909,-998l1007267,44239r3668,-946l1014510,42502r3575,-791l1022009,41043r2800,-553l1027610,39937r2306,-414l1031313,39182r1397,-340l1033544,38355r-351,94l1032841,38543r-1662,639l1029203,39747r-1975,565l1024329,40865r-2991,974l1018346,42814r-3563,1496l1011252,45593r-3531,1283l1003892,48319r-3740,1220l996412,50758r-3851,902l988812,52910r-3748,1250l981316,55717r-3655,1323l974006,58363r-3598,1350l966881,60847r-22037,5084l940643,66491r-26400,1364l907941,68002r-7278,48l893482,68084r-7181,35l878636,68091r-7479,-27l863678,68037r-7095,-61l848607,67922r-7977,-53l832058,67801r-8758,-58l816654,67738r-6778,21l803000,67730,760336,65296,725193,62489r-6415,-526l712527,61468r-8233,-633l696613,60531r-7437,-749l681738,59034r-7251,-1108l667903,56977r-6585,-948l655245,54977r-5579,-888l644087,53201r-4721,-844l634428,51651r-4937,-707l624629,50347r-4587,-496l615455,49356r-4376,-372l606908,48678r-4171,-306l598808,48176r-3794,-159l591219,47857r-3307,195l584142,47724r-3771,-329l576318,46673r-3927,-627l568464,45418r-3738,-788l560579,43960,522142,39715r-23164,-943l492987,38607r-6194,-96l480564,38435r-6230,-77l467700,38602r-6100,-288l455500,38025r-5727,-708l443966,36702r-5808,-616l432509,35293r-5753,-674l421002,33944r-5729,-700l409445,32654,369885,29676r-41003,-884l323995,28769r-4519,11l314682,28791r-4794,12l304860,28833r-4743,26l295374,28885r-4428,34l286226,28949r-4720,29l276782,29009r-4986,26l241310,29153r-5075,13l230882,29176r-5018,8l220846,29192r-4968,4l211202,29200r-4677,4l202325,29205r-4520,1l193285,29207r-22381,-3l166661,29203r-4096,-2l158624,29200r-3941,-2l150920,29197r-3660,-1l143601,29195r-3498,-1l136667,29193r-3436,-1l129921,29192r-3280,-1l123360,29190r-3462,270l116983,29190r-2915,-271l111658,28199r-2506,-629l106645,26940r-2284,-823l101945,25416r-2416,-702l97157,23710r-2500,-349l92158,23012r-2824,-115l86948,23324r-2386,427l82263,24641r-1923,1281l78415,27204r-1645,1780l75404,31015r-1366,2031l72999,35509r-855,2600l71289,40709r-559,2925l70276,46617r-453,2982l69329,53068r93,2936l69516,58940r702,2611l70839,64236r622,2683l72102,69467r1049,2642l74201,74750r8700,12004l85076,88680r35618,8791l123995,97467r3284,-11l130563,97444r3036,168l137156,97252r3556,-360l144179,96038r4437,-743l153053,94552r5252,-950l163777,92794r5473,-808l175312,91419r6139,-973l187590,89473r6785,-1358l200614,86955r6239,-1160l213116,84542r5767,-1057l245004,79375r4428,-839l253859,77697r4043,-1141l261784,75583r3883,-973l269237,73572r3490,-875l292166,68636r3104,-463l298299,67835r3048,-278l304395,67280r3018,99l310455,66973r3041,-407l316266,65788r3331,-673l322928,64442r3794,-815l330441,62936r3719,-691l338090,61551r3821,-583l345731,60385r3872,-517l353364,59439r3762,-430l360848,58670r3633,-280l368113,58110r3555,-193l375158,57759r3490,-158l382056,57514r3365,-70l388786,57375r3294,-20l395350,57342r3271,-14l401837,57345r3207,17l408251,57379r2901,33l414592,57441r3440,28l421901,57505r3781,30l429462,57565r3966,30l437277,57621r3848,25l445005,57670r3768,18l452540,57708r3717,15l487395,57782r3261,l493917,57783r3208,-1l500324,57782r3200,-1l506419,57780r3435,-1l513289,57777r3866,-2l520932,57774r3779,-1l528675,57772r3847,-1l536369,57770r3879,-2l544016,57768r3767,-1l551500,57766r3627,l558753,57765r3274,l565777,57764r3750,l573641,57764r3984,l581608,57764r3566,-1l609715,57763r5378,1l660538,57764r3876,l792730,57764r4141,270l800855,57764r3982,-270l808425,56774r4010,-629l816445,55516r4050,-823l824916,53992r23282,-2970l853028,50281r4830,-742l862786,48704r5161,-1217l873107,46270r5359,-1774l883995,42979r5528,-1518l894996,40061r6122,-1680l907240,36701r6759,-2056l920726,32900r6727,-1745l934785,29391r6696,-1482l948177,26428r29793,-5103l983251,20606r4810,-500l992583,19699r4522,-408l1001458,19332r3644,-452l1008745,18427r2845,-775l1014446,16985r2855,-668l1019717,15535r2515,-662l1024748,14211r2871,-652l1029537,13013r1917,-547l1032985,11990r754,-396l1034491,11198r-208,-577l1034055,10637r-227,17l1033325,11204r-949,489l1031428,12184r-1375,479l1028365,13577r-1687,913l1024561,15933r-2311,1239l1019941,18412r-2668,1139l1014505,21013r-2768,1462l1008707,24348r-3067,1594l986236,34280r-3308,1050l979580,35911r-3322,973l972935,37857r-3328,1222l966303,40116r-3305,1039l959705,42219r-3273,895l953159,44008r-16174,3129l933501,47582r-3918,313l925760,48151r-3822,256l894183,48890r-5381,-21l883758,48848r-5044,-20l873692,48781r-4724,-42l864245,48697r-4529,217l855416,48599r-4301,-315l847063,47517r-3897,-668l839268,46181r-3664,-859l832031,44591r-3573,-731l825071,43371r-3344,-908l818384,41555r-2943,-1301l811972,39142r-3470,-1112l804662,36815r-3752,-1025l797157,34765r-3366,-966l789456,32992r-4336,-808l780135,31777r-5239,-831l769656,30115r-5757,-1138l758019,28006r-5880,-972l745625,26263r-6010,-1146l733604,23971r-5784,-1535l721956,21126r-5863,-1308l710306,18431r-5872,-1167l698561,16096r-6153,-1076l686720,14121r-5689,-899l675471,12754r-5169,-882l665133,10991,660545,9827r-4841,-992l650864,7842,645922,6798r-4662,-880l636597,5039r-4548,-807l627728,3558r-4321,-673l619289,2333r-3955,-455l611378,1422,591876,260,587843,129,583752,78,579805,39,575858,r-3892,12l568192,26r-3774,13l560748,82r-3585,38l553578,157r-3205,50l546681,250r-3691,43l539213,69r-4196,309l530821,686r-4771,756l521506,2101r-4545,658l512235,3607r-4487,722l503262,5051r-4170,479l494588,6431r-4504,900l485281,8625r-4557,1106l476167,10838r-4572,1211l467247,13070r-4349,1022l458679,14785r-4045,1076l450590,16936r-3866,1396l442979,19522r-3745,1189l435663,21952r-3498,1044l428667,24040r-3357,952l421990,25786r-3320,794l415452,27225r-3206,534l409039,28293r-2872,113l402754,28989r-3414,583l395510,30479r-3747,778l388016,32036r-3928,879l380272,33659r-22452,3599l354212,37685r-3529,324l347215,38275r-3468,267l340361,38448r-3348,411l333665,39270r-3279,791l327128,40745r-3259,684l320931,42258r-3469,704l294693,46527r-3852,438l286964,47312r-3765,285l279433,47883r-38520,801l235356,48666r-5206,-17l224945,48633r-5329,-35l214627,48569r-4990,-29l204789,48504r-4573,-31l195644,48443r-4324,-31l187194,48385r-4126,-26l179201,48336r-3742,-19l171718,48297r-3520,-15l164745,48269r-3453,-13l158004,48248r-3262,-8l151481,48233r-18743,-13l129666,48221r-3087,l123492,48222r-3081,2l117316,48225r-3096,1l111119,48228r-3114,1l104892,48230r-2854,2l98635,48233r-3402,1l91368,48235r-3778,1l83811,48236r-3982,1l75965,48238r-3864,l68197,48239r-3789,l60618,48240r-3741,l53229,48240r-3648,l28884,48240r-3291,-270l4720,53631,2722,54962,1301,56520,650,57840,,59159r4691,5222l6451,65171r13509,2245l23004,67693r16850,420l43282,68129r3488,-40l50211,68052r3441,-37l57097,67679r3402,212l63901,68104r3379,653l70624,69328r3344,571l77278,70665r3286,654l83851,71972r3253,693l90342,73249r3239,583l96792,74371r3205,449l103200,75269r15886,1386l122256,76837r18979,381l144398,77211r3165,-8l150728,77195r3166,-28l157062,77143r3167,-24l163398,77086r3170,-29l169738,77029r3171,-30l176081,76973r3173,-25l182427,76654r3174,250l188774,77154r3175,704l195124,78473r3174,616l201204,79902r3445,693l227474,84282r4147,470l236252,85137r4423,319l245097,85774r4295,231l254010,86193r4619,188l263645,86495r4740,91l273126,86678r4793,36l282455,86741r4536,28l291398,86760r4202,-10l299802,86741r4004,-30l307666,86685r3861,-26l315189,86354r3573,239l322336,86833r3408,689l329106,88124r3362,602l335709,89524r3224,681l342158,90885r3147,718l348452,92207r3148,605l354704,93367r3113,463l360931,94294r2825,380l367133,94987r3377,315l389597,96104r3832,91l397302,96231r3763,27l404828,96285r3718,-8l412175,96268r3629,-9l419354,96230r3484,-26l426323,96179r3401,-35l433084,96115r3360,-30l439732,96054r3266,-27l481126,95855r3147,-5l487417,95849r3150,-1l493716,95846r2881,l500022,95847r3425,l507326,95848r3790,1l514906,95850r3988,2l522762,95853r3868,2l530535,95856r3789,1l538114,95858r3738,1l545498,95860r3645,1l552703,95861r3494,2l559691,95863r3405,l566459,95864r3363,l573111,95865r3267,l579644,95865r34841,l617630,95865r18898,l639685,95864r82545,l725518,96134r3266,-270l732051,95594r2940,-720l738463,94245r3471,-629l745821,92793r3794,-701l753409,91390r3968,-735l761226,90037r22579,-2831l787694,86888r34274,-958l826472,85904r4323,10l835435,85924r4641,10l845079,85965r4729,27l854537,86019r4763,35l863810,86085r4509,30l872421,86147r4443,27l881306,86202r4695,24l890464,86247r4464,21l899390,86285r4255,14l907900,86313r4127,11l915994,86332r3967,9l923488,86346r3959,4l931405,86354r4248,1l939744,86357r4091,1l947990,86357r4001,l955992,86357r3943,-2l963751,86355r3816,-1l971273,86352r3614,-2l978502,86349r3497,-1l985437,86347r3440,-2l992215,86344r3306,-1l998827,86342r2961,l1005276,86341r3488,-1l1012652,86340r3794,l1020241,86339r3961,l1028045,86339r3843,l1035752,86339r3754,-1l1043259,86338r3698,l1050568,86338r3611,l1057705,86339r20528,l1079608,86339e" filled="f" strokecolor="white" strokeweight="1.85206mm">
                         <v:path arrowok="t"/>
                       </v:shape>
@@ -4585,7 +4585,7 @@
                 </mc:Choice>
                 <mc:Fallback>
                   <w:pict>
-                    <v:group w14:anchorId="1B60B0F1" id="Group 66" o:spid="_x0000_s1026" style="position:absolute;margin-left:139.05pt;margin-top:10.6pt;width:5.25pt;height:5.25pt;z-index:15741440;mso-wrap-distance-left:0;mso-wrap-distance-right:0" coordsize="66675,66675" o:gfxdata="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">
+                    <v:group w14:anchorId="0F1B12C4" id="Group 66" o:spid="_x0000_s1026" style="position:absolute;margin-left:139.05pt;margin-top:10.6pt;width:5.25pt;height:5.25pt;z-index:15741440;mso-wrap-distance-left:0;mso-wrap-distance-right:0" coordsize="66675,66675" o:gfxdata="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">
                       <v:shape id="Graphic 67" o:spid="_x0000_s1027" style="position:absolute;width:66675;height:66675;visibility:visible;mso-wrap-style:square;v-text-anchor:top" coordsize="66675,66675" o:gfxdata="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" path="m,33337l9764,9764,33337,,56910,9764r9765,23573l56910,56910,33337,66675,9764,56910,,33337xe" stroked="f">
                         <v:path arrowok="t"/>
                       </v:shape>
@@ -8079,7 +8079,7 @@
                 </mc:Choice>
                 <mc:Fallback>
                   <w:pict>
-                    <v:group w14:anchorId="3F506807" id="Group 72" o:spid="_x0000_s1026" style="position:absolute;margin-left:5.9pt;margin-top:4.45pt;width:22.1pt;height:22.1pt;z-index:-16061440;mso-wrap-distance-left:0;mso-wrap-distance-right:0" coordsize="280670,280670" o:gfxdata="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">
+                    <v:group w14:anchorId="41FF8F16" id="Group 72" o:spid="_x0000_s1026" style="position:absolute;margin-left:5.9pt;margin-top:4.45pt;width:22.1pt;height:22.1pt;z-index:-16061440;mso-wrap-distance-left:0;mso-wrap-distance-right:0" coordsize="280670,280670" o:gfxdata="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">
                       <v:shape id="Graphic 73" o:spid="_x0000_s1027" style="position:absolute;left:6350;top:6350;width:267970;height:267970;visibility:visible;mso-wrap-style:square;v-text-anchor:top" coordsize="267970,267970" o:gfxdata="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" path="m,133985l6830,91618,25849,54836,54853,25838,91633,6826,133985,r42351,6826l213116,25838r29004,28998l261139,91618r6831,42367l261139,176302r-19019,36776l213116,242094r-36780,19037l133985,267970,91633,261131,54853,242094,25849,213078,6830,176302,,133985xe" filled="f" strokeweight="1pt">
                         <v:path arrowok="t"/>
                       </v:shape>
@@ -8622,7 +8622,7 @@
                 </mc:Choice>
                 <mc:Fallback>
                   <w:pict>
-                    <v:group w14:anchorId="7550B746" id="Group 76" o:spid="_x0000_s1026" style="position:absolute;margin-left:6.05pt;margin-top:3.55pt;width:22.1pt;height:22.1pt;z-index:-16060928;mso-wrap-distance-left:0;mso-wrap-distance-right:0" coordsize="280670,280670" o:gfxdata="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">
+                    <v:group w14:anchorId="1329AD27" id="Group 76" o:spid="_x0000_s1026" style="position:absolute;margin-left:6.05pt;margin-top:3.55pt;width:22.1pt;height:22.1pt;z-index:-16060928;mso-wrap-distance-left:0;mso-wrap-distance-right:0" coordsize="280670,280670" o:gfxdata="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">
                       <v:shape id="Graphic 77" o:spid="_x0000_s1027" style="position:absolute;left:6350;top:6350;width:267970;height:267970;visibility:visible;mso-wrap-style:square;v-text-anchor:top" coordsize="267970,267970" o:gfxdata="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" path="m,133985l6830,91618,25849,54836,54853,25838,91633,6826,133985,r42351,6826l213116,25838r29004,28998l261139,91618r6831,42367l261139,176351r-19019,36782l213116,242131r-36780,19012l133985,267970,91633,261143,54853,242131,25849,213133,6830,176351,,133985xe" filled="f" strokeweight="1pt">
                         <v:path arrowok="t"/>
                       </v:shape>
@@ -9109,7 +9109,7 @@
                 </mc:Choice>
                 <mc:Fallback>
                   <w:pict>
-                    <v:group w14:anchorId="00B74FC0" id="Group 80" o:spid="_x0000_s1026" style="position:absolute;margin-left:6pt;margin-top:4.15pt;width:22.1pt;height:22.1pt;z-index:-16060416;mso-wrap-distance-left:0;mso-wrap-distance-right:0" coordsize="280670,280670" o:gfxdata="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">
+                    <v:group w14:anchorId="6D2D4C6F" id="Group 80" o:spid="_x0000_s1026" style="position:absolute;margin-left:6pt;margin-top:4.15pt;width:22.1pt;height:22.1pt;z-index:-16060416;mso-wrap-distance-left:0;mso-wrap-distance-right:0" coordsize="280670,280670" o:gfxdata="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">
                       <v:shape id="Graphic 81" o:spid="_x0000_s1027" style="position:absolute;left:6350;top:6350;width:267970;height:267970;visibility:visible;mso-wrap-style:square;v-text-anchor:top" coordsize="267970,267970" o:gfxdata="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" path="m,133984l6830,91618,25849,54836,54853,25838,91633,6826,133985,r42351,6826l213116,25838r29004,28998l261139,91618r6831,42366l261139,176351r-19019,36782l213116,242131r-36780,19012l133985,267969,91633,261143,54853,242131,25849,213133,6830,176351,,133984xe" filled="f" strokeweight="1pt">
                         <v:path arrowok="t"/>
                       </v:shape>
@@ -9606,7 +9606,7 @@
                 </mc:Choice>
                 <mc:Fallback>
                   <w:pict>
-                    <v:group w14:anchorId="63320723" id="Group 84" o:spid="_x0000_s1026" style="position:absolute;margin-left:5.8pt;margin-top:-8.85pt;width:22.1pt;height:22.1pt;z-index:-16059904;mso-wrap-distance-left:0;mso-wrap-distance-right:0" coordsize="280670,280670" o:gfxdata="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">
+                    <v:group w14:anchorId="23C8BF80" id="Group 84" o:spid="_x0000_s1026" style="position:absolute;margin-left:5.8pt;margin-top:-8.85pt;width:22.1pt;height:22.1pt;z-index:-16059904;mso-wrap-distance-left:0;mso-wrap-distance-right:0" coordsize="280670,280670" o:gfxdata="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">
                       <v:shape id="Graphic 85" o:spid="_x0000_s1027" style="position:absolute;left:6350;top:6350;width:267970;height:267970;visibility:visible;mso-wrap-style:square;v-text-anchor:top" coordsize="267970,267970" o:gfxdata="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" path="m,133984l6830,91618,25849,54836,54853,25838,91633,6826,133985,r42351,6826l213116,25838r29004,28998l261139,91618r6831,42366l261139,176351r-19019,36782l213116,242131r-36780,19012l133985,267970,91633,261143,54853,242131,25849,213133,6830,176351,,133984xe" filled="f" strokeweight="1pt">
                         <v:path arrowok="t"/>
                       </v:shape>
@@ -10185,7 +10185,7 @@
                 </mc:Choice>
                 <mc:Fallback>
                   <w:pict>
-                    <v:group w14:anchorId="579B2FD2" id="Group 88" o:spid="_x0000_s1026" style="position:absolute;margin-left:5.95pt;margin-top:4.2pt;width:22.1pt;height:22.1pt;z-index:-16059392;mso-wrap-distance-left:0;mso-wrap-distance-right:0" coordsize="280670,280670" o:gfxdata="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">
+                    <v:group w14:anchorId="16D41020" id="Group 88" o:spid="_x0000_s1026" style="position:absolute;margin-left:5.95pt;margin-top:4.2pt;width:22.1pt;height:22.1pt;z-index:-16059392;mso-wrap-distance-left:0;mso-wrap-distance-right:0" coordsize="280670,280670" o:gfxdata="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">
                       <v:shape id="Graphic 89" o:spid="_x0000_s1027" style="position:absolute;left:6350;top:6350;width:267970;height:267970;visibility:visible;mso-wrap-style:square;v-text-anchor:top" coordsize="267970,267970" o:gfxdata="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" path="m,133984l6830,91618,25849,54836,54853,25838,91633,6826,133984,r42347,6826l213111,25838r29005,28998l261138,91618r6832,42366l261138,176302r-19022,36776l213111,242094r-36780,19037l133984,267970,91633,261131,54853,242094,25849,213078,6830,176302,,133984xe" filled="f" strokeweight="1pt">
                         <v:path arrowok="t"/>
                       </v:shape>
@@ -10590,7 +10590,7 @@
                 </mc:Choice>
                 <mc:Fallback>
                   <w:pict>
-                    <v:group w14:anchorId="7476AAA8" id="Group 92" o:spid="_x0000_s1026" style="position:absolute;margin-left:5.8pt;margin-top:4.3pt;width:22.1pt;height:22.1pt;z-index:-16058880;mso-wrap-distance-left:0;mso-wrap-distance-right:0" coordsize="280670,280670" o:gfxdata="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">
+                    <v:group w14:anchorId="4F6A9E81" id="Group 92" o:spid="_x0000_s1026" style="position:absolute;margin-left:5.8pt;margin-top:4.3pt;width:22.1pt;height:22.1pt;z-index:-16058880;mso-wrap-distance-left:0;mso-wrap-distance-right:0" coordsize="280670,280670" o:gfxdata="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">
                       <v:shape id="Graphic 93" o:spid="_x0000_s1027" style="position:absolute;left:6350;top:6350;width:267970;height:267970;visibility:visible;mso-wrap-style:square;v-text-anchor:top" coordsize="267970,267970" o:gfxdata="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" path="m,133985l6830,91618,25849,54836,54853,25838,91633,6826,133985,r42351,6826l213116,25838r29004,28998l261139,91618r6831,42367l261139,176351r-19019,36782l213116,242131r-36780,19012l133985,267970,91633,261143,54853,242131,25849,213133,6830,176351,,133985xe" filled="f" strokeweight="1pt">
                         <v:path arrowok="t"/>
                       </v:shape>
@@ -12844,7 +12844,7 @@
                 </mc:Choice>
                 <mc:Fallback>
                   <w:pict>
-                    <v:group w14:anchorId="422A352C" id="Group 106" o:spid="_x0000_s1026" style="width:53.6pt;height:.75pt;mso-position-horizontal-relative:char;mso-position-vertical-relative:line" coordsize="6807,95" o:gfxdata="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">
+                    <v:group w14:anchorId="6366B16E" id="Group 106" o:spid="_x0000_s1026" style="width:53.6pt;height:.75pt;mso-position-horizontal-relative:char;mso-position-vertical-relative:line" coordsize="6807,95" o:gfxdata="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">
                       <v:shape id="Graphic 107" o:spid="_x0000_s1027" style="position:absolute;top:47;width:6807;height:13;visibility:visible;mso-wrap-style:square;v-text-anchor:top" coordsize="680720,1270" o:gfxdata="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" path="m,l680720,e" filled="f">
                         <v:path arrowok="t"/>
                       </v:shape>
@@ -13327,7 +13327,7 @@
                 </mc:Choice>
                 <mc:Fallback>
                   <w:pict>
-                    <v:group w14:anchorId="433AE0C4" id="Group 108" o:spid="_x0000_s1026" style="width:53.6pt;height:.75pt;mso-position-horizontal-relative:char;mso-position-vertical-relative:line" coordsize="6807,95" o:gfxdata="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">
+                    <v:group w14:anchorId="2988C18C" id="Group 108" o:spid="_x0000_s1026" style="width:53.6pt;height:.75pt;mso-position-horizontal-relative:char;mso-position-vertical-relative:line" coordsize="6807,95" o:gfxdata="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">
                       <v:shape id="Graphic 109" o:spid="_x0000_s1027" style="position:absolute;top:47;width:6807;height:13;visibility:visible;mso-wrap-style:square;v-text-anchor:top" coordsize="680720,1270" o:gfxdata="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" path="m,l680720,e" filled="f">
                         <v:path arrowok="t"/>
                       </v:shape>
@@ -13822,7 +13822,7 @@
                 </mc:Choice>
                 <mc:Fallback>
                   <w:pict>
-                    <v:group w14:anchorId="4A3C7ABD" id="Group 110" o:spid="_x0000_s1026" style="width:53.6pt;height:.75pt;mso-position-horizontal-relative:char;mso-position-vertical-relative:line" coordsize="6807,95" o:gfxdata="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">
+                    <v:group w14:anchorId="7FA73597" id="Group 110" o:spid="_x0000_s1026" style="width:53.6pt;height:.75pt;mso-position-horizontal-relative:char;mso-position-vertical-relative:line" coordsize="6807,95" o:gfxdata="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">
                       <v:shape id="Graphic 111" o:spid="_x0000_s1027" style="position:absolute;top:47;width:6807;height:13;visibility:visible;mso-wrap-style:square;v-text-anchor:top" coordsize="680720,1270" o:gfxdata="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" path="m,l680719,e" filled="f">
                         <v:path arrowok="t"/>
                       </v:shape>
@@ -14033,7 +14033,7 @@
                 </mc:Choice>
                 <mc:Fallback>
                   <w:pict>
-                    <v:group w14:anchorId="0C2346FF" id="Group 112" o:spid="_x0000_s1026" style="position:absolute;margin-left:109.05pt;margin-top:2.6pt;width:88.45pt;height:10.25pt;z-index:-16058368;mso-wrap-distance-left:0;mso-wrap-distance-right:0" coordsize="11233,1301" o:gfxdata="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">
+                    <v:group w14:anchorId="5089CE35" id="Group 112" o:spid="_x0000_s1026" style="position:absolute;margin-left:109.05pt;margin-top:2.6pt;width:88.45pt;height:10.25pt;z-index:-16058368;mso-wrap-distance-left:0;mso-wrap-distance-right:0" coordsize="11233,1301" o:gfxdata="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">
                       <v:shapetype id="_x0000_t75" coordsize="21600,21600" o:spt="75" o:preferrelative="t" path="m@4@5l@4@11@9@11@9@5xe" filled="f" stroked="f">
                         <v:stroke joinstyle="miter"/>
                         <v:formulas>
@@ -14227,7 +14227,7 @@
                 </mc:Choice>
                 <mc:Fallback>
                   <w:pict>
-                    <v:group w14:anchorId="0B4CB6DC" id="Group 114" o:spid="_x0000_s1026" style="position:absolute;margin-left:127.7pt;margin-top:2.7pt;width:88.45pt;height:10.25pt;z-index:-16057344;mso-wrap-distance-left:0;mso-wrap-distance-right:0" coordsize="11233,1301" o:gfxdata="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">
+                    <v:group w14:anchorId="3757670A" id="Group 114" o:spid="_x0000_s1026" style="position:absolute;margin-left:127.7pt;margin-top:2.7pt;width:88.45pt;height:10.25pt;z-index:-16057344;mso-wrap-distance-left:0;mso-wrap-distance-right:0" coordsize="11233,1301" o:gfxdata="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">
                       <v:shape id="Image 115" o:spid="_x0000_s1027" type="#_x0000_t75" style="position:absolute;width:11232;height:1299;visibility:visible;mso-wrap-style:square" o:gfxdata="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">
                         <v:imagedata r:id="rId12" o:title=""/>
                       </v:shape>
@@ -14553,7 +14553,7 @@
                 </mc:Choice>
                 <mc:Fallback>
                   <w:pict>
-                    <v:group w14:anchorId="64CA270C" id="Group 117" o:spid="_x0000_s1026" style="position:absolute;margin-left:128.95pt;margin-top:1.9pt;width:88.45pt;height:10.25pt;z-index:-16057856;mso-wrap-distance-left:0;mso-wrap-distance-right:0" coordsize="11233,1301" o:gfxdata="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">
+                    <v:group w14:anchorId="2ACBAFAF" id="Group 117" o:spid="_x0000_s1026" style="position:absolute;margin-left:128.95pt;margin-top:1.9pt;width:88.45pt;height:10.25pt;z-index:-16057856;mso-wrap-distance-left:0;mso-wrap-distance-right:0" coordsize="11233,1301" o:gfxdata="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">
                       <v:shape id="Image 118" o:spid="_x0000_s1027" type="#_x0000_t75" style="position:absolute;width:11232;height:1298;visibility:visible;mso-wrap-style:square" o:gfxdata="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">
                         <v:imagedata r:id="rId12" o:title=""/>
                       </v:shape>
@@ -14918,8 +14918,23 @@
       <w:r>
         <w:rPr>
           <w:b/>
+          <w:spacing w:val="-1"/>
         </w:rPr>
-        <w:t>2022</w:t>
+        <w:t>{{</w:t>
+      </w:r>
+      <w:r>
+        <w:rPr>
+          <w:b/>
+          <w:spacing w:val="-1"/>
+        </w:rPr>
+        <w:t>CurrentYear</w:t>
+      </w:r>
+      <w:r>
+        <w:rPr>
+          <w:b/>
+          <w:spacing w:val="-1"/>
+        </w:rPr>
+        <w:t>}}</w:t>
       </w:r>
       <w:r>
         <w:rPr>
@@ -17858,7 +17873,7 @@
 </file>
 
 <file path=word/endnotes.xml><?xml version="1.0" encoding="utf-8"?>
-<w:endnotes xmlns:wpc="http://schemas.microsoft.com/office/word/2010/wordprocessingCanvas" xmlns:cx="http://schemas.microsoft.com/office/drawing/2014/chartex" xmlns:cx1="http://schemas.microsoft.com/office/drawing/2015/9/8/chartex" xmlns:cx2="http://schemas.microsoft.com/office/drawing/2015/10/21/chartex" xmlns:cx3="http://schemas.microsoft.com/office/drawing/2016/5/9/chartex" xmlns:cx4="http://schemas.microsoft.com/office/drawing/2016/5/10/chartex" xmlns:cx5="http://schemas.microsoft.com/office/drawing/2016/5/11/chartex" xmlns:cx6="http://schemas.microsoft.com/office/drawing/2016/5/12/chartex" xmlns:cx7="http://schemas.microsoft.com/office/drawing/2016/5/13/chartex" xmlns:cx8="http://schemas.microsoft.com/office/drawing/2016/5/14/chartex" xmlns:mc="http://schemas.openxmlformats.org/markup-compatibility/2006" xmlns:aink="http://schemas.microsoft.com/office/drawing/2016/ink" xmlns:am3d="http://schemas.microsoft.com/office/drawing/2017/model3d" xmlns:o="urn:schemas-microsoft-com:office:office" xmlns:oel="http://schemas.microsoft.com/office/2019/extlst" xmlns:r="http://schemas.openxmlformats.org/officeDocument/2006/relationships" xmlns:m="http://schemas.openxmlformats.org/officeDocument/2006/math" xmlns:v="urn:schemas-microsoft-com:vml" xmlns:wp14="http://schemas.microsoft.com/office/word/2010/wordprocessingDrawing" xmlns:wp="http://schemas.openxmlformats.org/drawingml/2006/wordprocessingDrawing" xmlns:w10="urn:schemas-microsoft-com:office:word" xmlns:w="http://schemas.openxmlformats.org/wordprocessingml/2006/main" xmlns:w14="http://schemas.microsoft.com/office/word/2010/wordml" xmlns:w15="http://schemas.microsoft.com/office/word/2012/wordml" xmlns:w16cex="http://schemas.microsoft.com/office/word/2018/wordml/cex" xmlns:w16cid="http://schemas.microsoft.com/office/word/2016/wordml/cid" xmlns:w16="http://schemas.microsoft.com/office/word/2018/wordml" xmlns:w16sdtdh="http://schemas.microsoft.com/office/word/2020/wordml/sdtdatahash" xmlns:w16se="http://schemas.microsoft.com/office/word/2015/wordml/symex" xmlns:wpg="http://schemas.microsoft.com/office/word/2010/wordprocessingGroup" xmlns:wpi="http://schemas.microsoft.com/office/word/2010/wordprocessingInk" xmlns:wne="http://schemas.microsoft.com/office/word/2006/wordml" xmlns:wps="http://schemas.microsoft.com/office/word/2010/wordprocessingShape" mc:Ignorable="w14 w15 w16se w16cid w16 w16cex w16sdtdh wp14">
+<w:endnotes xmlns:wpc="http://schemas.microsoft.com/office/word/2010/wordprocessingCanvas" xmlns:cx="http://schemas.microsoft.com/office/drawing/2014/chartex" xmlns:cx1="http://schemas.microsoft.com/office/drawing/2015/9/8/chartex" xmlns:cx2="http://schemas.microsoft.com/office/drawing/2015/10/21/chartex" xmlns:cx3="http://schemas.microsoft.com/office/drawing/2016/5/9/chartex" xmlns:cx4="http://schemas.microsoft.com/office/drawing/2016/5/10/chartex" xmlns:cx5="http://schemas.microsoft.com/office/drawing/2016/5/11/chartex" xmlns:cx6="http://schemas.microsoft.com/office/drawing/2016/5/12/chartex" xmlns:cx7="http://schemas.microsoft.com/office/drawing/2016/5/13/chartex" xmlns:cx8="http://schemas.microsoft.com/office/drawing/2016/5/14/chartex" xmlns:mc="http://schemas.openxmlformats.org/markup-compatibility/2006" xmlns:aink="http://schemas.microsoft.com/office/drawing/2016/ink" xmlns:am3d="http://schemas.microsoft.com/office/drawing/2017/model3d" xmlns:o="urn:schemas-microsoft-com:office:office" xmlns:oel="http://schemas.microsoft.com/office/2019/extlst" xmlns:r="http://schemas.openxmlformats.org/officeDocument/2006/relationships" xmlns:m="http://schemas.openxmlformats.org/officeDocument/2006/math" xmlns:v="urn:schemas-microsoft-com:vml" xmlns:wp14="http://schemas.microsoft.com/office/word/2010/wordprocessingDrawing" xmlns:wp="http://schemas.openxmlformats.org/drawingml/2006/wordprocessingDrawing" xmlns:w10="urn:schemas-microsoft-com:office:word" xmlns:w="http://schemas.openxmlformats.org/wordprocessingml/2006/main" xmlns:w14="http://schemas.microsoft.com/office/word/2010/wordml" xmlns:w15="http://schemas.microsoft.com/office/word/2012/wordml" xmlns:w16cex="http://schemas.microsoft.com/office/word/2018/wordml/cex" xmlns:w16cid="http://schemas.microsoft.com/office/word/2016/wordml/cid" xmlns:w16="http://schemas.microsoft.com/office/word/2018/wordml" xmlns:w16du="http://schemas.microsoft.com/office/word/2023/wordml/word16du" xmlns:w16sdtdh="http://schemas.microsoft.com/office/word/2020/wordml/sdtdatahash" xmlns:w16sdtfl="http://schemas.microsoft.com/office/word/2024/wordml/sdtformatlock" xmlns:w16se="http://schemas.microsoft.com/office/word/2015/wordml/symex" xmlns:wpg="http://schemas.microsoft.com/office/word/2010/wordprocessingGroup" xmlns:wpi="http://schemas.microsoft.com/office/word/2010/wordprocessingInk" xmlns:wne="http://schemas.microsoft.com/office/word/2006/wordml" xmlns:wps="http://schemas.microsoft.com/office/word/2010/wordprocessingShape" mc:Ignorable="w14 w15 w16se w16cid w16 w16cex w16sdtdh w16sdtfl w16du wp14">
   <w:endnote w:type="separator" w:id="-1">
     <w:p>
       <w:r>
@@ -17877,7 +17892,7 @@
 </file>
 
 <file path=word/footer1.xml><?xml version="1.0" encoding="utf-8"?>
-<w:ftr xmlns:wpc="http://schemas.microsoft.com/office/word/2010/wordprocessingCanvas" xmlns:cx="http://schemas.microsoft.com/office/drawing/2014/chartex" xmlns:cx1="http://schemas.microsoft.com/office/drawing/2015/9/8/chartex" xmlns:cx2="http://schemas.microsoft.com/office/drawing/2015/10/21/chartex" xmlns:cx3="http://schemas.microsoft.com/office/drawing/2016/5/9/chartex" xmlns:cx4="http://schemas.microsoft.com/office/drawing/2016/5/10/chartex" xmlns:cx5="http://schemas.microsoft.com/office/drawing/2016/5/11/chartex" xmlns:cx6="http://schemas.microsoft.com/office/drawing/2016/5/12/chartex" xmlns:cx7="http://schemas.microsoft.com/office/drawing/2016/5/13/chartex" xmlns:cx8="http://schemas.microsoft.com/office/drawing/2016/5/14/chartex" xmlns:mc="http://schemas.openxmlformats.org/markup-compatibility/2006" xmlns:aink="http://schemas.microsoft.com/office/drawing/2016/ink" xmlns:am3d="http://schemas.microsoft.com/office/drawing/2017/model3d" xmlns:o="urn:schemas-microsoft-com:office:office" xmlns:oel="http://schemas.microsoft.com/office/2019/extlst" xmlns:r="http://schemas.openxmlformats.org/officeDocument/2006/relationships" xmlns:m="http://schemas.openxmlformats.org/officeDocument/2006/math" xmlns:v="urn:schemas-microsoft-com:vml" xmlns:wp14="http://schemas.microsoft.com/office/word/2010/wordprocessingDrawing" xmlns:wp="http://schemas.openxmlformats.org/drawingml/2006/wordprocessingDrawing" xmlns:w10="urn:schemas-microsoft-com:office:word" xmlns:w="http://schemas.openxmlformats.org/wordprocessingml/2006/main" xmlns:w14="http://schemas.microsoft.com/office/word/2010/wordml" xmlns:w15="http://schemas.microsoft.com/office/word/2012/wordml" xmlns:w16cex="http://schemas.microsoft.com/office/word/2018/wordml/cex" xmlns:w16cid="http://schemas.microsoft.com/office/word/2016/wordml/cid" xmlns:w16="http://schemas.microsoft.com/office/word/2018/wordml" xmlns:w16sdtdh="http://schemas.microsoft.com/office/word/2020/wordml/sdtdatahash" xmlns:w16se="http://schemas.microsoft.com/office/word/2015/wordml/symex" xmlns:wpg="http://schemas.microsoft.com/office/word/2010/wordprocessingGroup" xmlns:wpi="http://schemas.microsoft.com/office/word/2010/wordprocessingInk" xmlns:wne="http://schemas.microsoft.com/office/word/2006/wordml" xmlns:wps="http://schemas.microsoft.com/office/word/2010/wordprocessingShape" mc:Ignorable="w14 w15 w16se w16cid w16 w16cex w16sdtdh wp14">
+<w:ftr xmlns:wpc="http://schemas.microsoft.com/office/word/2010/wordprocessingCanvas" xmlns:cx="http://schemas.microsoft.com/office/drawing/2014/chartex" xmlns:cx1="http://schemas.microsoft.com/office/drawing/2015/9/8/chartex" xmlns:cx2="http://schemas.microsoft.com/office/drawing/2015/10/21/chartex" xmlns:cx3="http://schemas.microsoft.com/office/drawing/2016/5/9/chartex" xmlns:cx4="http://schemas.microsoft.com/office/drawing/2016/5/10/chartex" xmlns:cx5="http://schemas.microsoft.com/office/drawing/2016/5/11/chartex" xmlns:cx6="http://schemas.microsoft.com/office/drawing/2016/5/12/chartex" xmlns:cx7="http://schemas.microsoft.com/office/drawing/2016/5/13/chartex" xmlns:cx8="http://schemas.microsoft.com/office/drawing/2016/5/14/chartex" xmlns:mc="http://schemas.openxmlformats.org/markup-compatibility/2006" xmlns:aink="http://schemas.microsoft.com/office/drawing/2016/ink" xmlns:am3d="http://schemas.microsoft.com/office/drawing/2017/model3d" xmlns:o="urn:schemas-microsoft-com:office:office" xmlns:oel="http://schemas.microsoft.com/office/2019/extlst" xmlns:r="http://schemas.openxmlformats.org/officeDocument/2006/relationships" xmlns:m="http://schemas.openxmlformats.org/officeDocument/2006/math" xmlns:v="urn:schemas-microsoft-com:vml" xmlns:wp14="http://schemas.microsoft.com/office/word/2010/wordprocessingDrawing" xmlns:wp="http://schemas.openxmlformats.org/drawingml/2006/wordprocessingDrawing" xmlns:w10="urn:schemas-microsoft-com:office:word" xmlns:w="http://schemas.openxmlformats.org/wordprocessingml/2006/main" xmlns:w14="http://schemas.microsoft.com/office/word/2010/wordml" xmlns:w15="http://schemas.microsoft.com/office/word/2012/wordml" xmlns:w16cex="http://schemas.microsoft.com/office/word/2018/wordml/cex" xmlns:w16cid="http://schemas.microsoft.com/office/word/2016/wordml/cid" xmlns:w16="http://schemas.microsoft.com/office/word/2018/wordml" xmlns:w16du="http://schemas.microsoft.com/office/word/2023/wordml/word16du" xmlns:w16sdtdh="http://schemas.microsoft.com/office/word/2020/wordml/sdtdatahash" xmlns:w16sdtfl="http://schemas.microsoft.com/office/word/2024/wordml/sdtformatlock" xmlns:w16se="http://schemas.microsoft.com/office/word/2015/wordml/symex" xmlns:wpg="http://schemas.microsoft.com/office/word/2010/wordprocessingGroup" xmlns:wpi="http://schemas.microsoft.com/office/word/2010/wordprocessingInk" xmlns:wne="http://schemas.microsoft.com/office/word/2006/wordml" xmlns:wps="http://schemas.microsoft.com/office/word/2010/wordprocessingShape" mc:Ignorable="w14 w15 w16se w16cid w16 w16cex w16sdtdh w16sdtfl w16du wp14">
   <w:p>
     <w:pPr>
       <w:pStyle w:val="BodyText"/>
@@ -18397,7 +18412,7 @@
 </file>
 
 <file path=word/footnotes.xml><?xml version="1.0" encoding="utf-8"?>
-<w:footnotes xmlns:wpc="http://schemas.microsoft.com/office/word/2010/wordprocessingCanvas" xmlns:cx="http://schemas.microsoft.com/office/drawing/2014/chartex" xmlns:cx1="http://schemas.microsoft.com/office/drawing/2015/9/8/chartex" xmlns:cx2="http://schemas.microsoft.com/office/drawing/2015/10/21/chartex" xmlns:cx3="http://schemas.microsoft.com/office/drawing/2016/5/9/chartex" xmlns:cx4="http://schemas.microsoft.com/office/drawing/2016/5/10/chartex" xmlns:cx5="http://schemas.microsoft.com/office/drawing/2016/5/11/chartex" xmlns:cx6="http://schemas.microsoft.com/office/drawing/2016/5/12/chartex" xmlns:cx7="http://schemas.microsoft.com/office/drawing/2016/5/13/chartex" xmlns:cx8="http://schemas.microsoft.com/office/drawing/2016/5/14/chartex" xmlns:mc="http://schemas.openxmlformats.org/markup-compatibility/2006" xmlns:aink="http://schemas.microsoft.com/office/drawing/2016/ink" xmlns:am3d="http://schemas.microsoft.com/office/drawing/2017/model3d" xmlns:o="urn:schemas-microsoft-com:office:office" xmlns:oel="http://schemas.microsoft.com/office/2019/extlst" xmlns:r="http://schemas.openxmlformats.org/officeDocument/2006/relationships" xmlns:m="http://schemas.openxmlformats.org/officeDocument/2006/math" xmlns:v="urn:schemas-microsoft-com:vml" xmlns:wp14="http://schemas.microsoft.com/office/word/2010/wordprocessingDrawing" xmlns:wp="http://schemas.openxmlformats.org/drawingml/2006/wordprocessingDrawing" xmlns:w10="urn:schemas-microsoft-com:office:word" xmlns:w="http://schemas.openxmlformats.org/wordprocessingml/2006/main" xmlns:w14="http://schemas.microsoft.com/office/word/2010/wordml" xmlns:w15="http://schemas.microsoft.com/office/word/2012/wordml" xmlns:w16cex="http://schemas.microsoft.com/office/word/2018/wordml/cex" xmlns:w16cid="http://schemas.microsoft.com/office/word/2016/wordml/cid" xmlns:w16="http://schemas.microsoft.com/office/word/2018/wordml" xmlns:w16sdtdh="http://schemas.microsoft.com/office/word/2020/wordml/sdtdatahash" xmlns:w16se="http://schemas.microsoft.com/office/word/2015/wordml/symex" xmlns:wpg="http://schemas.microsoft.com/office/word/2010/wordprocessingGroup" xmlns:wpi="http://schemas.microsoft.com/office/word/2010/wordprocessingInk" xmlns:wne="http://schemas.microsoft.com/office/word/2006/wordml" xmlns:wps="http://schemas.microsoft.com/office/word/2010/wordprocessingShape" mc:Ignorable="w14 w15 w16se w16cid w16 w16cex w16sdtdh wp14">
+<w:footnotes xmlns:wpc="http://schemas.microsoft.com/office/word/2010/wordprocessingCanvas" xmlns:cx="http://schemas.microsoft.com/office/drawing/2014/chartex" xmlns:cx1="http://schemas.microsoft.com/office/drawing/2015/9/8/chartex" xmlns:cx2="http://schemas.microsoft.com/office/drawing/2015/10/21/chartex" xmlns:cx3="http://schemas.microsoft.com/office/drawing/2016/5/9/chartex" xmlns:cx4="http://schemas.microsoft.com/office/drawing/2016/5/10/chartex" xmlns:cx5="http://schemas.microsoft.com/office/drawing/2016/5/11/chartex" xmlns:cx6="http://schemas.microsoft.com/office/drawing/2016/5/12/chartex" xmlns:cx7="http://schemas.microsoft.com/office/drawing/2016/5/13/chartex" xmlns:cx8="http://schemas.microsoft.com/office/drawing/2016/5/14/chartex" xmlns:mc="http://schemas.openxmlformats.org/markup-compatibility/2006" xmlns:aink="http://schemas.microsoft.com/office/drawing/2016/ink" xmlns:am3d="http://schemas.microsoft.com/office/drawing/2017/model3d" xmlns:o="urn:schemas-microsoft-com:office:office" xmlns:oel="http://schemas.microsoft.com/office/2019/extlst" xmlns:r="http://schemas.openxmlformats.org/officeDocument/2006/relationships" xmlns:m="http://schemas.openxmlformats.org/officeDocument/2006/math" xmlns:v="urn:schemas-microsoft-com:vml" xmlns:wp14="http://schemas.microsoft.com/office/word/2010/wordprocessingDrawing" xmlns:wp="http://schemas.openxmlformats.org/drawingml/2006/wordprocessingDrawing" xmlns:w10="urn:schemas-microsoft-com:office:word" xmlns:w="http://schemas.openxmlformats.org/wordprocessingml/2006/main" xmlns:w14="http://schemas.microsoft.com/office/word/2010/wordml" xmlns:w15="http://schemas.microsoft.com/office/word/2012/wordml" xmlns:w16cex="http://schemas.microsoft.com/office/word/2018/wordml/cex" xmlns:w16cid="http://schemas.microsoft.com/office/word/2016/wordml/cid" xmlns:w16="http://schemas.microsoft.com/office/word/2018/wordml" xmlns:w16du="http://schemas.microsoft.com/office/word/2023/wordml/word16du" xmlns:w16sdtdh="http://schemas.microsoft.com/office/word/2020/wordml/sdtdatahash" xmlns:w16sdtfl="http://schemas.microsoft.com/office/word/2024/wordml/sdtformatlock" xmlns:w16se="http://schemas.microsoft.com/office/word/2015/wordml/symex" xmlns:wpg="http://schemas.microsoft.com/office/word/2010/wordprocessingGroup" xmlns:wpi="http://schemas.microsoft.com/office/word/2010/wordprocessingInk" xmlns:wne="http://schemas.microsoft.com/office/word/2006/wordml" xmlns:wps="http://schemas.microsoft.com/office/word/2010/wordprocessingShape" mc:Ignorable="w14 w15 w16se w16cid w16 w16cex w16sdtdh w16sdtfl w16du wp14">
   <w:footnote w:type="separator" w:id="-1">
     <w:p>
       <w:r>
@@ -18416,7 +18431,7 @@
 </file>
 
 <file path=word/styles.xml><?xml version="1.0" encoding="utf-8"?>
-<w:styles xmlns:mc="http://schemas.openxmlformats.org/markup-compatibility/2006" xmlns:r="http://schemas.openxmlformats.org/officeDocument/2006/relationships" xmlns:w="http://schemas.openxmlformats.org/wordprocessingml/2006/main" xmlns:w14="http://schemas.microsoft.com/office/word/2010/wordml" xmlns:w15="http://schemas.microsoft.com/office/word/2012/wordml" xmlns:w16cex="http://schemas.microsoft.com/office/word/2018/wordml/cex" xmlns:w16cid="http://schemas.microsoft.com/office/word/2016/wordml/cid" xmlns:w16="http://schemas.microsoft.com/office/word/2018/wordml" xmlns:w16sdtdh="http://schemas.microsoft.com/office/word/2020/wordml/sdtdatahash" xmlns:w16se="http://schemas.microsoft.com/office/word/2015/wordml/symex" mc:Ignorable="w14 w15 w16se w16cid w16 w16cex w16sdtdh">
+<w:styles xmlns:mc="http://schemas.openxmlformats.org/markup-compatibility/2006" xmlns:r="http://schemas.openxmlformats.org/officeDocument/2006/relationships" xmlns:w="http://schemas.openxmlformats.org/wordprocessingml/2006/main" xmlns:w14="http://schemas.microsoft.com/office/word/2010/wordml" xmlns:w15="http://schemas.microsoft.com/office/word/2012/wordml" xmlns:w16cex="http://schemas.microsoft.com/office/word/2018/wordml/cex" xmlns:w16cid="http://schemas.microsoft.com/office/word/2016/wordml/cid" xmlns:w16="http://schemas.microsoft.com/office/word/2018/wordml" xmlns:w16du="http://schemas.microsoft.com/office/word/2023/wordml/word16du" xmlns:w16sdtdh="http://schemas.microsoft.com/office/word/2020/wordml/sdtdatahash" xmlns:w16sdtfl="http://schemas.microsoft.com/office/word/2024/wordml/sdtformatlock" xmlns:w16se="http://schemas.microsoft.com/office/word/2015/wordml/symex" mc:Ignorable="w14 w15 w16se w16cid w16 w16cex w16sdtdh w16sdtfl w16du">
   <w:docDefaults>
     <w:rPrDefault>
       <w:rPr>
@@ -19169,4 +19184,10 @@
   <a:objectDefaults/>
   <a:extraClrSchemeLst/>
 </a:theme>
+</file>
+
+<file path=docMetadata/LabelInfo.xml><?xml version="1.0" encoding="utf-8"?>
+<clbl:labelList xmlns:clbl="http://schemas.microsoft.com/office/2020/mipLabelMetadata">
+  <clbl:label id="{d9290083-bd2f-48a2-8ac5-09a524b17d15}" enabled="1" method="Privileged" siteId="{b9fec68c-c92d-461e-9a97-3d03a0f18b82}" contentBits="1" removed="0"/>
+</clbl:labelList>
 </file>
</xml_diff>